<commit_message>
Auto push at 21:05:34
</commit_message>
<xml_diff>
--- a/Semester 6/EEE/template/template sessional.docx
+++ b/Semester 6/EEE/template/template sessional.docx
@@ -946,7 +946,7 @@
           <w:szCs w:val="36"/>
           <w:lang w:val="en-US" w:bidi="ar-SA"/>
         </w:rPr>
-        <w:t xml:space="preserve">Semister: </w:t>
+        <w:t xml:space="preserve">Semester: </w:t>
       </w:r>
       <w:r>
         <w:rPr>
@@ -1150,7 +1150,7 @@
           <w:szCs w:val="36"/>
           <w:lang w:val="en-US" w:bidi="ar-SA"/>
         </w:rPr>
-        <w:t xml:space="preserve">Course TItle:</w:t>
+        <w:t xml:space="preserve">Course Title:</w:t>
       </w:r>
       <w:r>
         <w:rPr>

</xml_diff>